<commit_message>
chore(docs): update FP-Abwesenheit document
</commit_message>
<xml_diff>
--- a/Docs/Management/FP-Abwesenheit.docx
+++ b/Docs/Management/FP-Abwesenheit.docx
@@ -13,23 +13,7 @@
     </w:p>
     <w:p>
       <w:r>
-        <w:t xml:space="preserve">In diesem Dokument tragt ihr bitte eure Abwesenheiten ein. Gemeint sind Tage außerhalb der Uni und der Arbeit an denen ihr verhindert </w:t>
-      </w:r>
-      <w:proofErr w:type="gramStart"/>
-      <w:r>
-        <w:t>seit</w:t>
-      </w:r>
-      <w:proofErr w:type="gramEnd"/>
-      <w:r>
-        <w:t xml:space="preserve"> und nicht arbeiten könnten (Urlaub, Schulungen von der Firma). Bei Krankheitsfällen reicht </w:t>
-      </w:r>
-      <w:proofErr w:type="gramStart"/>
-      <w:r>
-        <w:t>es</w:t>
-      </w:r>
-      <w:proofErr w:type="gramEnd"/>
-      <w:r>
-        <w:t xml:space="preserve"> wenn ihr kurz im Chat Bescheid gebt. </w:t>
+        <w:t xml:space="preserve">In diesem Dokument tragt ihr bitte eure Abwesenheiten ein. Gemeint sind Tage außerhalb der Uni und der Arbeit an denen ihr verhindert seit und nicht arbeiten könnten (Urlaub, Schulungen von der Firma). Bei Krankheitsfällen reicht es wenn ihr kurz im Chat Bescheid gebt. </w:t>
       </w:r>
     </w:p>
     <w:p>
@@ -126,11 +110,9 @@
             <w:tcW w:w="236" w:type="dxa"/>
           </w:tcPr>
           <w:p>
-            <w:proofErr w:type="spellStart"/>
             <w:r>
               <w:t>Apri</w:t>
             </w:r>
-            <w:proofErr w:type="spellEnd"/>
           </w:p>
         </w:tc>
         <w:tc>
@@ -453,13 +435,21 @@
           <w:tcPr>
             <w:tcW w:w="473" w:type="dxa"/>
           </w:tcPr>
-          <w:p/>
-        </w:tc>
-        <w:tc>
-          <w:tcPr>
-            <w:tcW w:w="473" w:type="dxa"/>
-          </w:tcPr>
-          <w:p/>
+          <w:p>
+            <w:r>
+              <w:t>X</w:t>
+            </w:r>
+          </w:p>
+        </w:tc>
+        <w:tc>
+          <w:tcPr>
+            <w:tcW w:w="473" w:type="dxa"/>
+          </w:tcPr>
+          <w:p>
+            <w:r>
+              <w:t>X</w:t>
+            </w:r>
+          </w:p>
         </w:tc>
         <w:tc>
           <w:tcPr>
@@ -899,25 +889,41 @@
             <w:tcW w:w="473" w:type="dxa"/>
             <w:shd w:val="clear" w:color="auto" w:fill="00B050"/>
           </w:tcPr>
-          <w:p/>
-        </w:tc>
-        <w:tc>
-          <w:tcPr>
-            <w:tcW w:w="473" w:type="dxa"/>
-          </w:tcPr>
-          <w:p/>
-        </w:tc>
-        <w:tc>
-          <w:tcPr>
-            <w:tcW w:w="473" w:type="dxa"/>
-          </w:tcPr>
-          <w:p/>
-        </w:tc>
-        <w:tc>
-          <w:tcPr>
-            <w:tcW w:w="473" w:type="dxa"/>
-          </w:tcPr>
-          <w:p/>
+          <w:p>
+            <w:r>
+              <w:t>X</w:t>
+            </w:r>
+          </w:p>
+        </w:tc>
+        <w:tc>
+          <w:tcPr>
+            <w:tcW w:w="473" w:type="dxa"/>
+          </w:tcPr>
+          <w:p>
+            <w:r>
+              <w:t>X</w:t>
+            </w:r>
+          </w:p>
+        </w:tc>
+        <w:tc>
+          <w:tcPr>
+            <w:tcW w:w="473" w:type="dxa"/>
+          </w:tcPr>
+          <w:p>
+            <w:r>
+              <w:t>X</w:t>
+            </w:r>
+          </w:p>
+        </w:tc>
+        <w:tc>
+          <w:tcPr>
+            <w:tcW w:w="473" w:type="dxa"/>
+          </w:tcPr>
+          <w:p>
+            <w:r>
+              <w:t>X</w:t>
+            </w:r>
+          </w:p>
         </w:tc>
       </w:tr>
       <w:tr>
@@ -936,13 +942,21 @@
             <w:tcW w:w="398" w:type="dxa"/>
             <w:shd w:val="clear" w:color="auto" w:fill="00B050"/>
           </w:tcPr>
-          <w:p/>
+          <w:p>
+            <w:r>
+              <w:t>X</w:t>
+            </w:r>
+          </w:p>
         </w:tc>
         <w:tc>
           <w:tcPr>
             <w:tcW w:w="397" w:type="dxa"/>
           </w:tcPr>
-          <w:p/>
+          <w:p>
+            <w:r>
+              <w:t>X</w:t>
+            </w:r>
+          </w:p>
         </w:tc>
         <w:tc>
           <w:tcPr>
@@ -1521,7 +1535,11 @@
           <w:tcPr>
             <w:tcW w:w="473" w:type="dxa"/>
           </w:tcPr>
-          <w:p/>
+          <w:p>
+            <w:r>
+              <w:t>X</w:t>
+            </w:r>
+          </w:p>
         </w:tc>
         <w:tc>
           <w:tcPr>
@@ -1988,49 +2006,57 @@
           <w:tcPr>
             <w:tcW w:w="381" w:type="dxa"/>
           </w:tcPr>
-          <w:p/>
-        </w:tc>
-        <w:tc>
-          <w:tcPr>
-            <w:tcW w:w="381" w:type="dxa"/>
-          </w:tcPr>
-          <w:p/>
-        </w:tc>
-        <w:tc>
-          <w:tcPr>
-            <w:tcW w:w="381" w:type="dxa"/>
-          </w:tcPr>
-          <w:p/>
-        </w:tc>
-        <w:tc>
-          <w:tcPr>
-            <w:tcW w:w="381" w:type="dxa"/>
-          </w:tcPr>
-          <w:p/>
-        </w:tc>
-        <w:tc>
-          <w:tcPr>
-            <w:tcW w:w="473" w:type="dxa"/>
-          </w:tcPr>
-          <w:p/>
-        </w:tc>
-        <w:tc>
-          <w:tcPr>
-            <w:tcW w:w="473" w:type="dxa"/>
-          </w:tcPr>
-          <w:p/>
-        </w:tc>
-        <w:tc>
-          <w:tcPr>
-            <w:tcW w:w="473" w:type="dxa"/>
-          </w:tcPr>
-          <w:p/>
-        </w:tc>
-        <w:tc>
-          <w:tcPr>
-            <w:tcW w:w="473" w:type="dxa"/>
-          </w:tcPr>
-          <w:p/>
+          <w:p>
+            <w:r>
+              <w:t>X</w:t>
+            </w:r>
+          </w:p>
+        </w:tc>
+        <w:tc>
+          <w:tcPr>
+            <w:tcW w:w="381" w:type="dxa"/>
+          </w:tcPr>
+          <w:p/>
+        </w:tc>
+        <w:tc>
+          <w:tcPr>
+            <w:tcW w:w="381" w:type="dxa"/>
+          </w:tcPr>
+          <w:p/>
+        </w:tc>
+        <w:tc>
+          <w:tcPr>
+            <w:tcW w:w="381" w:type="dxa"/>
+          </w:tcPr>
+          <w:p/>
+        </w:tc>
+        <w:tc>
+          <w:tcPr>
+            <w:tcW w:w="473" w:type="dxa"/>
+          </w:tcPr>
+          <w:p/>
+        </w:tc>
+        <w:tc>
+          <w:tcPr>
+            <w:tcW w:w="473" w:type="dxa"/>
+          </w:tcPr>
+          <w:p/>
+        </w:tc>
+        <w:tc>
+          <w:tcPr>
+            <w:tcW w:w="473" w:type="dxa"/>
+          </w:tcPr>
+          <w:p/>
+        </w:tc>
+        <w:tc>
+          <w:tcPr>
+            <w:tcW w:w="473" w:type="dxa"/>
+          </w:tcPr>
+          <w:p>
+            <w:r>
+              <w:t>X</w:t>
+            </w:r>
+          </w:p>
         </w:tc>
         <w:tc>
           <w:tcPr>
@@ -2464,67 +2490,87 @@
           <w:tcPr>
             <w:tcW w:w="473" w:type="dxa"/>
           </w:tcPr>
-          <w:p/>
-        </w:tc>
-        <w:tc>
-          <w:tcPr>
-            <w:tcW w:w="473" w:type="dxa"/>
-          </w:tcPr>
-          <w:p/>
-        </w:tc>
-        <w:tc>
-          <w:tcPr>
-            <w:tcW w:w="473" w:type="dxa"/>
-          </w:tcPr>
-          <w:p/>
-        </w:tc>
-        <w:tc>
-          <w:tcPr>
-            <w:tcW w:w="473" w:type="dxa"/>
-          </w:tcPr>
-          <w:p/>
-        </w:tc>
-        <w:tc>
-          <w:tcPr>
-            <w:tcW w:w="473" w:type="dxa"/>
-          </w:tcPr>
-          <w:p/>
-        </w:tc>
-        <w:tc>
-          <w:tcPr>
-            <w:tcW w:w="473" w:type="dxa"/>
-          </w:tcPr>
-          <w:p/>
-        </w:tc>
-        <w:tc>
-          <w:tcPr>
-            <w:tcW w:w="473" w:type="dxa"/>
-          </w:tcPr>
-          <w:p/>
-        </w:tc>
-        <w:tc>
-          <w:tcPr>
-            <w:tcW w:w="473" w:type="dxa"/>
-          </w:tcPr>
-          <w:p/>
-        </w:tc>
-        <w:tc>
-          <w:tcPr>
-            <w:tcW w:w="473" w:type="dxa"/>
-          </w:tcPr>
-          <w:p/>
-        </w:tc>
-        <w:tc>
-          <w:tcPr>
-            <w:tcW w:w="473" w:type="dxa"/>
-          </w:tcPr>
-          <w:p/>
-        </w:tc>
-        <w:tc>
-          <w:tcPr>
-            <w:tcW w:w="473" w:type="dxa"/>
-          </w:tcPr>
-          <w:p/>
+          <w:p>
+            <w:r>
+              <w:t>X</w:t>
+            </w:r>
+          </w:p>
+        </w:tc>
+        <w:tc>
+          <w:tcPr>
+            <w:tcW w:w="473" w:type="dxa"/>
+          </w:tcPr>
+          <w:p/>
+        </w:tc>
+        <w:tc>
+          <w:tcPr>
+            <w:tcW w:w="473" w:type="dxa"/>
+          </w:tcPr>
+          <w:p/>
+        </w:tc>
+        <w:tc>
+          <w:tcPr>
+            <w:tcW w:w="473" w:type="dxa"/>
+          </w:tcPr>
+          <w:p/>
+        </w:tc>
+        <w:tc>
+          <w:tcPr>
+            <w:tcW w:w="473" w:type="dxa"/>
+          </w:tcPr>
+          <w:p/>
+        </w:tc>
+        <w:tc>
+          <w:tcPr>
+            <w:tcW w:w="473" w:type="dxa"/>
+          </w:tcPr>
+          <w:p/>
+        </w:tc>
+        <w:tc>
+          <w:tcPr>
+            <w:tcW w:w="473" w:type="dxa"/>
+          </w:tcPr>
+          <w:p/>
+        </w:tc>
+        <w:tc>
+          <w:tcPr>
+            <w:tcW w:w="473" w:type="dxa"/>
+          </w:tcPr>
+          <w:p>
+            <w:r>
+              <w:t>X</w:t>
+            </w:r>
+          </w:p>
+        </w:tc>
+        <w:tc>
+          <w:tcPr>
+            <w:tcW w:w="473" w:type="dxa"/>
+          </w:tcPr>
+          <w:p>
+            <w:r>
+              <w:t>X</w:t>
+            </w:r>
+          </w:p>
+        </w:tc>
+        <w:tc>
+          <w:tcPr>
+            <w:tcW w:w="473" w:type="dxa"/>
+          </w:tcPr>
+          <w:p>
+            <w:r>
+              <w:t>X</w:t>
+            </w:r>
+          </w:p>
+        </w:tc>
+        <w:tc>
+          <w:tcPr>
+            <w:tcW w:w="473" w:type="dxa"/>
+          </w:tcPr>
+          <w:p>
+            <w:r>
+              <w:t>X</w:t>
+            </w:r>
+          </w:p>
         </w:tc>
       </w:tr>
       <w:tr>
@@ -2665,13 +2711,7 @@
           </w:tcPr>
           <w:p>
             <w:r>
-              <w:t>Ju</w:t>
-            </w:r>
-            <w:r>
-              <w:t>l</w:t>
-            </w:r>
-            <w:r>
-              <w:t>i</w:t>
+              <w:t>Juli</w:t>
             </w:r>
           </w:p>
         </w:tc>
@@ -2983,79 +3023,119 @@
           <w:tcPr>
             <w:tcW w:w="380" w:type="dxa"/>
           </w:tcPr>
-          <w:p/>
-        </w:tc>
-        <w:tc>
-          <w:tcPr>
-            <w:tcW w:w="381" w:type="dxa"/>
-          </w:tcPr>
-          <w:p/>
-        </w:tc>
-        <w:tc>
-          <w:tcPr>
-            <w:tcW w:w="381" w:type="dxa"/>
-          </w:tcPr>
-          <w:p/>
-        </w:tc>
-        <w:tc>
-          <w:tcPr>
-            <w:tcW w:w="381" w:type="dxa"/>
-          </w:tcPr>
-          <w:p/>
-        </w:tc>
-        <w:tc>
-          <w:tcPr>
-            <w:tcW w:w="381" w:type="dxa"/>
-          </w:tcPr>
-          <w:p/>
-        </w:tc>
-        <w:tc>
-          <w:tcPr>
-            <w:tcW w:w="381" w:type="dxa"/>
-          </w:tcPr>
-          <w:p/>
-        </w:tc>
-        <w:tc>
-          <w:tcPr>
-            <w:tcW w:w="381" w:type="dxa"/>
-          </w:tcPr>
-          <w:p/>
-        </w:tc>
-        <w:tc>
-          <w:tcPr>
-            <w:tcW w:w="381" w:type="dxa"/>
-          </w:tcPr>
-          <w:p/>
-        </w:tc>
-        <w:tc>
-          <w:tcPr>
-            <w:tcW w:w="381" w:type="dxa"/>
-          </w:tcPr>
-          <w:p/>
-        </w:tc>
-        <w:tc>
-          <w:tcPr>
-            <w:tcW w:w="473" w:type="dxa"/>
-          </w:tcPr>
-          <w:p/>
-        </w:tc>
-        <w:tc>
-          <w:tcPr>
-            <w:tcW w:w="473" w:type="dxa"/>
-          </w:tcPr>
-          <w:p/>
-        </w:tc>
-        <w:tc>
-          <w:tcPr>
-            <w:tcW w:w="473" w:type="dxa"/>
-          </w:tcPr>
-          <w:p/>
-        </w:tc>
-        <w:tc>
-          <w:tcPr>
-            <w:tcW w:w="473" w:type="dxa"/>
-          </w:tcPr>
-          <w:p/>
+          <w:p>
+            <w:r>
+              <w:t>X</w:t>
+            </w:r>
+          </w:p>
+        </w:tc>
+        <w:tc>
+          <w:tcPr>
+            <w:tcW w:w="381" w:type="dxa"/>
+          </w:tcPr>
+          <w:p>
+            <w:r>
+              <w:t>X</w:t>
+            </w:r>
+          </w:p>
+        </w:tc>
+        <w:tc>
+          <w:tcPr>
+            <w:tcW w:w="381" w:type="dxa"/>
+          </w:tcPr>
+          <w:p>
+            <w:r>
+              <w:t>X</w:t>
+            </w:r>
+          </w:p>
+        </w:tc>
+        <w:tc>
+          <w:tcPr>
+            <w:tcW w:w="381" w:type="dxa"/>
+          </w:tcPr>
+          <w:p>
+            <w:r>
+              <w:t>X</w:t>
+            </w:r>
+          </w:p>
+        </w:tc>
+        <w:tc>
+          <w:tcPr>
+            <w:tcW w:w="381" w:type="dxa"/>
+          </w:tcPr>
+          <w:p/>
+        </w:tc>
+        <w:tc>
+          <w:tcPr>
+            <w:tcW w:w="381" w:type="dxa"/>
+          </w:tcPr>
+          <w:p/>
+        </w:tc>
+        <w:tc>
+          <w:tcPr>
+            <w:tcW w:w="381" w:type="dxa"/>
+          </w:tcPr>
+          <w:p/>
+        </w:tc>
+        <w:tc>
+          <w:tcPr>
+            <w:tcW w:w="381" w:type="dxa"/>
+          </w:tcPr>
+          <w:p>
+            <w:r>
+              <w:t>X</w:t>
+            </w:r>
+          </w:p>
+        </w:tc>
+        <w:tc>
+          <w:tcPr>
+            <w:tcW w:w="381" w:type="dxa"/>
+          </w:tcPr>
+          <w:p>
+            <w:r>
+              <w:t>X</w:t>
+            </w:r>
+          </w:p>
+        </w:tc>
+        <w:tc>
+          <w:tcPr>
+            <w:tcW w:w="473" w:type="dxa"/>
+          </w:tcPr>
+          <w:p>
+            <w:r>
+              <w:t>X</w:t>
+            </w:r>
+          </w:p>
+        </w:tc>
+        <w:tc>
+          <w:tcPr>
+            <w:tcW w:w="473" w:type="dxa"/>
+          </w:tcPr>
+          <w:p>
+            <w:r>
+              <w:t>X</w:t>
+            </w:r>
+          </w:p>
+        </w:tc>
+        <w:tc>
+          <w:tcPr>
+            <w:tcW w:w="473" w:type="dxa"/>
+          </w:tcPr>
+          <w:p>
+            <w:r>
+              <w:t>X</w:t>
+            </w:r>
+          </w:p>
+        </w:tc>
+        <w:tc>
+          <w:tcPr>
+            <w:tcW w:w="473" w:type="dxa"/>
+          </w:tcPr>
+          <w:p>
+            <w:r>
+              <w:t>X</w:t>
+            </w:r>
+          </w:p>
         </w:tc>
         <w:tc>
           <w:tcPr>
@@ -3218,13 +3298,7 @@
           </w:tcPr>
           <w:p>
             <w:r>
-              <w:t>Ju</w:t>
-            </w:r>
-            <w:r>
-              <w:t>l</w:t>
-            </w:r>
-            <w:r>
-              <w:t>i</w:t>
+              <w:t>Juli</w:t>
             </w:r>
           </w:p>
         </w:tc>

</xml_diff>